<commit_message>
Dokumentacja: grupa, IntelliJ, oświadczenie
</commit_message>
<xml_diff>
--- a/docs/Hula_Dmytro_dokumentacja.docx
+++ b/docs/Hula_Dmytro_dokumentacja.docx
@@ -324,13 +324,10 @@
             </w:pPr>
             <w:r>
               <w:rPr>
-                <w:i/>
-                <w:iCs/>
-                <w:color w:val="8A969E"/>
                 <w:sz w:val="19"/>
                 <w:szCs w:val="19"/>
               </w:rPr>
-              <w:t xml:space="preserve">[np. INF_inż_S_gr1]</w:t>
+              <w:t xml:space="preserve">HTR_S7_10_2023_CW3_INF_INŻ. PROGR / studia stacjonarne</w:t>
             </w:r>
           </w:p>
         </w:tc>
@@ -3279,13 +3276,10 @@
             </w:pPr>
             <w:r>
               <w:rPr>
-                <w:i/>
-                <w:iCs/>
-                <w:color w:val="8A969E"/>
                 <w:sz w:val="19"/>
                 <w:szCs w:val="19"/>
               </w:rPr>
-              <w:t xml:space="preserve">[wersja]</w:t>
+              <w:t xml:space="preserve">2026.2 (Community)</w:t>
             </w:r>
           </w:p>
         </w:tc>
@@ -3312,13 +3306,10 @@
             </w:pPr>
             <w:r>
               <w:rPr>
-                <w:i/>
-                <w:iCs/>
-                <w:color w:val="8A969E"/>
                 <w:sz w:val="19"/>
                 <w:szCs w:val="19"/>
               </w:rPr>
-              <w:t xml:space="preserve">[środowisko programistyczne]</w:t>
+              <w:t xml:space="preserve">środowisko programistyczne</w:t>
             </w:r>
           </w:p>
         </w:tc>
@@ -11512,6 +11503,13 @@
             <w:pPr>
               <w:spacing w:after="40" w:line="252"/>
             </w:pPr>
+            <w:r>
+              <w:rPr>
+                <w:sz w:val="19"/>
+                <w:szCs w:val="19"/>
+              </w:rPr>
+              <w:t xml:space="preserve">Korzystałem z asystenta AI (Claude) jako wsparcia: przy konfiguracji środowiska (JDK, Maven, Tomcat), wyjaśnianiu błędów, podpowiedziach przy kodzie oraz przy redakcji dokumentacji. Kod przeanalizowałem, przetestowałem i potrafię go wyjaśnić.</w:t>
+            </w:r>
           </w:p>
         </w:tc>
       </w:tr>

</xml_diff>

<commit_message>
Dokumentacja: servlety, testy i dziennik etapu 2
</commit_message>
<xml_diff>
--- a/docs/Hula_Dmytro_dokumentacja.docx
+++ b/docs/Hula_Dmytro_dokumentacja.docx
@@ -599,7 +599,7 @@
                 <w:sz w:val="19"/>
                 <w:szCs w:val="19"/>
               </w:rPr>
-              <w:t xml:space="preserve">0.1, 10.10.2026</w:t>
+              <w:t>0.2, 24.10.2026</w:t>
             </w:r>
           </w:p>
         </w:tc>
@@ -1566,7 +1566,7 @@
                 <w:sz w:val="19"/>
                 <w:szCs w:val="19"/>
               </w:rPr>
-              <w:t xml:space="preserve">planowane</w:t>
+              <w:t xml:space="preserve">zrealizowane</w:t>
             </w:r>
           </w:p>
         </w:tc>
@@ -4338,13 +4338,10 @@
             </w:pPr>
             <w:r>
               <w:rPr>
-                <w:i/>
-                <w:iCs/>
-                <w:color w:val="8A969E"/>
                 <w:sz w:val="18"/>
                 <w:szCs w:val="18"/>
               </w:rPr>
-              <w:t xml:space="preserve">[/books]</w:t>
+              <w:t xml:space="preserve">/start</w:t>
             </w:r>
           </w:p>
         </w:tc>
@@ -4375,7 +4372,7 @@
                 <w:sz w:val="18"/>
                 <w:szCs w:val="18"/>
               </w:rPr>
-              <w:t xml:space="preserve">GET</w:t>
+              <w:t xml:space="preserve">GET, POST</w:t>
             </w:r>
           </w:p>
         </w:tc>
@@ -4402,13 +4399,10 @@
             </w:pPr>
             <w:r>
               <w:rPr>
-                <w:i/>
-                <w:iCs/>
-                <w:color w:val="8A969E"/>
                 <w:sz w:val="18"/>
                 <w:szCs w:val="18"/>
               </w:rPr>
-              <w:t xml:space="preserve">[BookServlet]</w:t>
+              <w:t xml:space="preserve">StartServlet</w:t>
             </w:r>
           </w:p>
         </w:tc>
@@ -4435,13 +4429,10 @@
             </w:pPr>
             <w:r>
               <w:rPr>
-                <w:i/>
-                <w:iCs/>
-                <w:color w:val="8A969E"/>
                 <w:sz w:val="18"/>
                 <w:szCs w:val="18"/>
               </w:rPr>
-              <w:t xml:space="preserve">[list.jsp]</w:t>
+              <w:t xml:space="preserve">brak JSP</w:t>
             </w:r>
           </w:p>
         </w:tc>
@@ -4468,13 +4459,10 @@
             </w:pPr>
             <w:r>
               <w:rPr>
-                <w:i/>
-                <w:iCs/>
-                <w:color w:val="8A969E"/>
                 <w:sz w:val="18"/>
                 <w:szCs w:val="18"/>
               </w:rPr>
-              <w:t xml:space="preserve">[lista książek]</w:t>
+              <w:t xml:space="preserve">repertuar i formularz imienia</w:t>
             </w:r>
           </w:p>
         </w:tc>
@@ -4506,13 +4494,10 @@
             </w:pPr>
             <w:r>
               <w:rPr>
-                <w:i/>
-                <w:iCs/>
-                <w:color w:val="8A969E"/>
                 <w:sz w:val="18"/>
                 <w:szCs w:val="18"/>
               </w:rPr>
-              <w:t xml:space="preserve">[/books/add]</w:t>
+              <w:t xml:space="preserve">/filmy/add</w:t>
             </w:r>
           </w:p>
         </w:tc>
@@ -4543,7 +4528,7 @@
                 <w:sz w:val="18"/>
                 <w:szCs w:val="18"/>
               </w:rPr>
-              <w:t xml:space="preserve">POST</w:t>
+              <w:t xml:space="preserve">GET, POST</w:t>
             </w:r>
           </w:p>
         </w:tc>
@@ -4570,13 +4555,10 @@
             </w:pPr>
             <w:r>
               <w:rPr>
-                <w:i/>
-                <w:iCs/>
-                <w:color w:val="8A969E"/>
                 <w:sz w:val="18"/>
                 <w:szCs w:val="18"/>
               </w:rPr>
-              <w:t xml:space="preserve">[…]</w:t>
+              <w:t xml:space="preserve">FilmFormServlet</w:t>
             </w:r>
           </w:p>
         </w:tc>
@@ -4603,13 +4585,10 @@
             </w:pPr>
             <w:r>
               <w:rPr>
-                <w:i/>
-                <w:iCs/>
-                <w:color w:val="8A969E"/>
                 <w:sz w:val="18"/>
                 <w:szCs w:val="18"/>
               </w:rPr>
-              <w:t xml:space="preserve">[…]</w:t>
+              <w:t xml:space="preserve">brak JSP</w:t>
             </w:r>
           </w:p>
         </w:tc>
@@ -4636,13 +4615,10 @@
             </w:pPr>
             <w:r>
               <w:rPr>
-                <w:i/>
-                <w:iCs/>
-                <w:color w:val="8A969E"/>
                 <w:sz w:val="18"/>
                 <w:szCs w:val="18"/>
               </w:rPr>
-              <w:t xml:space="preserve">[…]</w:t>
+              <w:t xml:space="preserve">formularz filmu i walidacja</w:t>
             </w:r>
           </w:p>
         </w:tc>
@@ -4672,6 +4648,13 @@
             <w:pPr>
               <w:spacing w:after="40" w:line="252"/>
             </w:pPr>
+            <w:r>
+              <w:rPr>
+                <w:sz w:val="18"/>
+                <w:szCs w:val="18"/>
+              </w:rPr>
+              <w:t>/filmy/dodany</w:t>
+            </w:r>
           </w:p>
         </w:tc>
         <w:tc>
@@ -4696,6 +4679,13 @@
               <w:spacing w:after="40" w:line="252"/>
               <w:jc w:val="center"/>
             </w:pPr>
+            <w:r>
+              <w:rPr>
+                <w:sz w:val="18"/>
+                <w:szCs w:val="18"/>
+              </w:rPr>
+              <w:t>GET</w:t>
+            </w:r>
           </w:p>
         </w:tc>
         <w:tc>
@@ -4719,6 +4709,13 @@
             <w:pPr>
               <w:spacing w:after="40" w:line="252"/>
             </w:pPr>
+            <w:r>
+              <w:rPr>
+                <w:sz w:val="18"/>
+                <w:szCs w:val="18"/>
+              </w:rPr>
+              <w:t>FilmDodanyServlet</w:t>
+            </w:r>
           </w:p>
         </w:tc>
         <w:tc>
@@ -4742,6 +4739,13 @@
             <w:pPr>
               <w:spacing w:after="40" w:line="252"/>
             </w:pPr>
+            <w:r>
+              <w:rPr>
+                <w:sz w:val="18"/>
+                <w:szCs w:val="18"/>
+              </w:rPr>
+              <w:t>brak JSP</w:t>
+            </w:r>
           </w:p>
         </w:tc>
         <w:tc>
@@ -4765,6 +4769,13 @@
             <w:pPr>
               <w:spacing w:after="40" w:line="252"/>
             </w:pPr>
+            <w:r>
+              <w:rPr>
+                <w:sz w:val="18"/>
+                <w:szCs w:val="18"/>
+              </w:rPr>
+              <w:t>potwierdzenie po redirect</w:t>
+            </w:r>
           </w:p>
         </w:tc>
       </w:tr>
@@ -4793,6 +4804,13 @@
             <w:pPr>
               <w:spacing w:after="40" w:line="252"/>
             </w:pPr>
+            <w:r>
+              <w:rPr>
+                <w:sz w:val="18"/>
+                <w:szCs w:val="18"/>
+              </w:rPr>
+              <w:t>/info, /lifecycle</w:t>
+            </w:r>
           </w:p>
         </w:tc>
         <w:tc>
@@ -4817,6 +4835,13 @@
               <w:spacing w:after="40" w:line="252"/>
               <w:jc w:val="center"/>
             </w:pPr>
+            <w:r>
+              <w:rPr>
+                <w:sz w:val="18"/>
+                <w:szCs w:val="18"/>
+              </w:rPr>
+              <w:t>GET</w:t>
+            </w:r>
           </w:p>
         </w:tc>
         <w:tc>
@@ -4840,6 +4865,13 @@
             <w:pPr>
               <w:spacing w:after="40" w:line="252"/>
             </w:pPr>
+            <w:r>
+              <w:rPr>
+                <w:sz w:val="18"/>
+                <w:szCs w:val="18"/>
+              </w:rPr>
+              <w:t>RequestInfoServlet, LifecycleServlet</w:t>
+            </w:r>
           </w:p>
         </w:tc>
         <w:tc>
@@ -4863,6 +4895,13 @@
             <w:pPr>
               <w:spacing w:after="40" w:line="252"/>
             </w:pPr>
+            <w:r>
+              <w:rPr>
+                <w:sz w:val="18"/>
+                <w:szCs w:val="18"/>
+              </w:rPr>
+              <w:t>brak JSP</w:t>
+            </w:r>
           </w:p>
         </w:tc>
         <w:tc>
@@ -4886,6 +4925,13 @@
             <w:pPr>
               <w:spacing w:after="40" w:line="252"/>
             </w:pPr>
+            <w:r>
+              <w:rPr>
+                <w:sz w:val="18"/>
+                <w:szCs w:val="18"/>
+              </w:rPr>
+              <w:t>parametry żądania i cykl życia</w:t>
+            </w:r>
           </w:p>
         </w:tc>
       </w:tr>
@@ -6744,12 +6790,26 @@
         <w:spacing w:after="120" w:line="276"/>
       </w:pPr>
       <w:r>
-        <w:rPr>
-          <w:i/>
-          <w:iCs/>
-          <w:color w:val="8A969E"/>
-        </w:rPr>
-        <w:t xml:space="preserve">[Opisz servlety, użycie @WebServlet, doGet / doPost, pobieranie parametrów, walidację oraz cykl życia servletu.]</w:t>
+        <w:rPr/>
+        <w:t xml:space="preserve">Z etapu 1 jest StartServlet (/start). GET wypisuje trzy filmy na sztywno, POST odbiera imię i film. Przed getParameter jest setCharacterEncoding("UTF-8"), żeby polskie znaki z formularza się nie psuły.</w:t>
+      </w:r>
+    </w:p>
+    <w:p>
+      <w:pPr>
+        <w:spacing w:after="120" w:line="276"/>
+      </w:pPr>
+      <w:r>
+        <w:rPr/>
+        <w:t xml:space="preserve">W etapie 2 doszedł formularz filmu. FilmFormServlet (/filmy/add) na GET pokazuje pusty formularz, a na POST czyta tytul, rezyser i rok. Tytuł i reżyser nie mogą być puste. Rok musi być liczbą z zakresu 1895–bieżący rok. Przy błędzie formularz wraca z komunikatami i z tym, co było wpisane. Po poprawnych danych jest sendRedirect na /filmy/dodany (Post/Redirect/Get), więc odświeżenie strony nie wysyła formularza drugi raz. Forward zostawiłby w przeglądarce adres formularza, dlatego po zapisie go nie używam.</w:t>
+      </w:r>
+    </w:p>
+    <w:p>
+      <w:pPr>
+        <w:spacing w:after="120" w:line="276"/>
+      </w:pPr>
+      <w:r>
+        <w:rPr/>
+        <w:t xml:space="preserve">RequestInfoServlet (/info) wypisuje metodę, URI, query string, adres klienta i parametry. LifecycleServlet (/lifecycle) startuje przy uruchomieniu aplikacji (loadOnStartup = 1). init() i destroy() piszą do logu Tomcata. Licznik żądań jest w AtomicInteger, bo jedna instancja servletu obsługuje wiele żądań naraz.</w:t>
       </w:r>
     </w:p>
     <w:p>
@@ -6768,7 +6828,7 @@
           <w:sz w:val="18"/>
           <w:szCs w:val="18"/>
         </w:rPr>
-        <w:t xml:space="preserve">@WebServlet("/books")</w:t>
+        <w:t xml:space="preserve">@WebServlet("/filmy/add")</w:t>
       </w:r>
     </w:p>
     <w:p>
@@ -6784,7 +6844,7 @@
           <w:sz w:val="18"/>
           <w:szCs w:val="18"/>
         </w:rPr>
-        <w:t xml:space="preserve">public class BookServlet extends HttpServlet {</w:t>
+        <w:t xml:space="preserve">public class FilmFormServlet extends HttpServlet {</w:t>
       </w:r>
     </w:p>
     <w:p>
@@ -6800,7 +6860,551 @@
           <w:sz w:val="18"/>
           <w:szCs w:val="18"/>
         </w:rPr>
-        <w:t xml:space="preserve">    // [wklej kluczowy fragment kodu i opisz go poniżej]</w:t>
+        <w:t xml:space="preserve">    @Override</w:t>
+      </w:r>
+    </w:p>
+    <w:p>
+      <w:pPr>
+        <w:shd w:fill="F3F5F7" w:color="auto" w:val="clear"/>
+        <w:spacing w:after="0" w:line="240"/>
+        <w:ind w:left="200" w:right="200"/>
+      </w:pPr>
+      <w:r>
+        <w:rPr>
+          <w:rFonts w:ascii="Consolas" w:cs="Consolas" w:eastAsia="Consolas" w:hAnsi="Consolas"/>
+          <w:color w:val="1E2A33"/>
+          <w:sz w:val="18"/>
+          <w:szCs w:val="18"/>
+        </w:rPr>
+        <w:t xml:space="preserve">    protected void doPost(HttpServletRequest req, HttpServletResponse resp) throws IOException {</w:t>
+      </w:r>
+    </w:p>
+    <w:p>
+      <w:pPr>
+        <w:shd w:fill="F3F5F7" w:color="auto" w:val="clear"/>
+        <w:spacing w:after="0" w:line="240"/>
+        <w:ind w:left="200" w:right="200"/>
+      </w:pPr>
+      <w:r>
+        <w:rPr>
+          <w:rFonts w:ascii="Consolas" w:cs="Consolas" w:eastAsia="Consolas" w:hAnsi="Consolas"/>
+          <w:color w:val="1E2A33"/>
+          <w:sz w:val="18"/>
+          <w:szCs w:val="18"/>
+        </w:rPr>
+        <w:t xml:space="preserve">        req.setCharacterEncoding("UTF-8");</w:t>
+      </w:r>
+    </w:p>
+    <w:p>
+      <w:pPr>
+        <w:shd w:fill="F3F5F7" w:color="auto" w:val="clear"/>
+        <w:spacing w:after="0" w:line="240"/>
+        <w:ind w:left="200" w:right="200"/>
+      </w:pPr>
+      <w:r>
+        <w:rPr>
+          <w:rFonts w:ascii="Consolas" w:cs="Consolas" w:eastAsia="Consolas" w:hAnsi="Consolas"/>
+          <w:color w:val="1E2A33"/>
+          <w:sz w:val="18"/>
+          <w:szCs w:val="18"/>
+        </w:rPr>
+        <w:t xml:space="preserve">        String tytul = trim(req.getParameter("tytul"));</w:t>
+      </w:r>
+    </w:p>
+    <w:p>
+      <w:pPr>
+        <w:shd w:fill="F3F5F7" w:color="auto" w:val="clear"/>
+        <w:spacing w:after="0" w:line="240"/>
+        <w:ind w:left="200" w:right="200"/>
+      </w:pPr>
+      <w:r>
+        <w:rPr>
+          <w:rFonts w:ascii="Consolas" w:cs="Consolas" w:eastAsia="Consolas" w:hAnsi="Consolas"/>
+          <w:color w:val="1E2A33"/>
+          <w:sz w:val="18"/>
+          <w:szCs w:val="18"/>
+        </w:rPr>
+        <w:t xml:space="preserve">        String rezyser = trim(req.getParameter("rezyser"));</w:t>
+      </w:r>
+    </w:p>
+    <w:p>
+      <w:pPr>
+        <w:shd w:fill="F3F5F7" w:color="auto" w:val="clear"/>
+        <w:spacing w:after="0" w:line="240"/>
+        <w:ind w:left="200" w:right="200"/>
+      </w:pPr>
+      <w:r>
+        <w:rPr>
+          <w:rFonts w:ascii="Consolas" w:cs="Consolas" w:eastAsia="Consolas" w:hAnsi="Consolas"/>
+          <w:color w:val="1E2A33"/>
+          <w:sz w:val="18"/>
+          <w:szCs w:val="18"/>
+        </w:rPr>
+        <w:t xml:space="preserve">        String rok = trim(req.getParameter("rok"));</w:t>
+      </w:r>
+    </w:p>
+    <w:p>
+      <w:pPr>
+        <w:shd w:fill="F3F5F7" w:color="auto" w:val="clear"/>
+        <w:spacing w:after="0" w:line="240"/>
+        <w:ind w:left="200" w:right="200"/>
+      </w:pPr>
+      <w:r>
+        <w:rPr>
+          <w:rFonts w:ascii="Consolas" w:cs="Consolas" w:eastAsia="Consolas" w:hAnsi="Consolas"/>
+          <w:color w:val="1E2A33"/>
+          <w:sz w:val="18"/>
+          <w:szCs w:val="18"/>
+        </w:rPr>
+        <w:t xml:space="preserve"/>
+      </w:r>
+    </w:p>
+    <w:p>
+      <w:pPr>
+        <w:shd w:fill="F3F5F7" w:color="auto" w:val="clear"/>
+        <w:spacing w:after="0" w:line="240"/>
+        <w:ind w:left="200" w:right="200"/>
+      </w:pPr>
+      <w:r>
+        <w:rPr>
+          <w:rFonts w:ascii="Consolas" w:cs="Consolas" w:eastAsia="Consolas" w:hAnsi="Consolas"/>
+          <w:color w:val="1E2A33"/>
+          <w:sz w:val="18"/>
+          <w:szCs w:val="18"/>
+        </w:rPr>
+        <w:t xml:space="preserve">        List&lt;String&gt; bledy = new ArrayList&lt;&gt;();</w:t>
+      </w:r>
+    </w:p>
+    <w:p>
+      <w:pPr>
+        <w:shd w:fill="F3F5F7" w:color="auto" w:val="clear"/>
+        <w:spacing w:after="0" w:line="240"/>
+        <w:ind w:left="200" w:right="200"/>
+      </w:pPr>
+      <w:r>
+        <w:rPr>
+          <w:rFonts w:ascii="Consolas" w:cs="Consolas" w:eastAsia="Consolas" w:hAnsi="Consolas"/>
+          <w:color w:val="1E2A33"/>
+          <w:sz w:val="18"/>
+          <w:szCs w:val="18"/>
+        </w:rPr>
+        <w:t xml:space="preserve">        if (tytul.isEmpty()) {</w:t>
+      </w:r>
+    </w:p>
+    <w:p>
+      <w:pPr>
+        <w:shd w:fill="F3F5F7" w:color="auto" w:val="clear"/>
+        <w:spacing w:after="0" w:line="240"/>
+        <w:ind w:left="200" w:right="200"/>
+      </w:pPr>
+      <w:r>
+        <w:rPr>
+          <w:rFonts w:ascii="Consolas" w:cs="Consolas" w:eastAsia="Consolas" w:hAnsi="Consolas"/>
+          <w:color w:val="1E2A33"/>
+          <w:sz w:val="18"/>
+          <w:szCs w:val="18"/>
+        </w:rPr>
+        <w:t xml:space="preserve">            bledy.add("Tytuł jest wymagany.");</w:t>
+      </w:r>
+    </w:p>
+    <w:p>
+      <w:pPr>
+        <w:shd w:fill="F3F5F7" w:color="auto" w:val="clear"/>
+        <w:spacing w:after="0" w:line="240"/>
+        <w:ind w:left="200" w:right="200"/>
+      </w:pPr>
+      <w:r>
+        <w:rPr>
+          <w:rFonts w:ascii="Consolas" w:cs="Consolas" w:eastAsia="Consolas" w:hAnsi="Consolas"/>
+          <w:color w:val="1E2A33"/>
+          <w:sz w:val="18"/>
+          <w:szCs w:val="18"/>
+        </w:rPr>
+        <w:t xml:space="preserve">        }</w:t>
+      </w:r>
+    </w:p>
+    <w:p>
+      <w:pPr>
+        <w:shd w:fill="F3F5F7" w:color="auto" w:val="clear"/>
+        <w:spacing w:after="0" w:line="240"/>
+        <w:ind w:left="200" w:right="200"/>
+      </w:pPr>
+      <w:r>
+        <w:rPr>
+          <w:rFonts w:ascii="Consolas" w:cs="Consolas" w:eastAsia="Consolas" w:hAnsi="Consolas"/>
+          <w:color w:val="1E2A33"/>
+          <w:sz w:val="18"/>
+          <w:szCs w:val="18"/>
+        </w:rPr>
+        <w:t xml:space="preserve">        if (rezyser.isEmpty()) {</w:t>
+      </w:r>
+    </w:p>
+    <w:p>
+      <w:pPr>
+        <w:shd w:fill="F3F5F7" w:color="auto" w:val="clear"/>
+        <w:spacing w:after="0" w:line="240"/>
+        <w:ind w:left="200" w:right="200"/>
+      </w:pPr>
+      <w:r>
+        <w:rPr>
+          <w:rFonts w:ascii="Consolas" w:cs="Consolas" w:eastAsia="Consolas" w:hAnsi="Consolas"/>
+          <w:color w:val="1E2A33"/>
+          <w:sz w:val="18"/>
+          <w:szCs w:val="18"/>
+        </w:rPr>
+        <w:t xml:space="preserve">            bledy.add("Reżyser jest wymagany.");</w:t>
+      </w:r>
+    </w:p>
+    <w:p>
+      <w:pPr>
+        <w:shd w:fill="F3F5F7" w:color="auto" w:val="clear"/>
+        <w:spacing w:after="0" w:line="240"/>
+        <w:ind w:left="200" w:right="200"/>
+      </w:pPr>
+      <w:r>
+        <w:rPr>
+          <w:rFonts w:ascii="Consolas" w:cs="Consolas" w:eastAsia="Consolas" w:hAnsi="Consolas"/>
+          <w:color w:val="1E2A33"/>
+          <w:sz w:val="18"/>
+          <w:szCs w:val="18"/>
+        </w:rPr>
+        <w:t xml:space="preserve">        }</w:t>
+      </w:r>
+    </w:p>
+    <w:p>
+      <w:pPr>
+        <w:shd w:fill="F3F5F7" w:color="auto" w:val="clear"/>
+        <w:spacing w:after="0" w:line="240"/>
+        <w:ind w:left="200" w:right="200"/>
+      </w:pPr>
+      <w:r>
+        <w:rPr>
+          <w:rFonts w:ascii="Consolas" w:cs="Consolas" w:eastAsia="Consolas" w:hAnsi="Consolas"/>
+          <w:color w:val="1E2A33"/>
+          <w:sz w:val="18"/>
+          <w:szCs w:val="18"/>
+        </w:rPr>
+        <w:t xml:space="preserve">        if (rok.isEmpty()) {</w:t>
+      </w:r>
+    </w:p>
+    <w:p>
+      <w:pPr>
+        <w:shd w:fill="F3F5F7" w:color="auto" w:val="clear"/>
+        <w:spacing w:after="0" w:line="240"/>
+        <w:ind w:left="200" w:right="200"/>
+      </w:pPr>
+      <w:r>
+        <w:rPr>
+          <w:rFonts w:ascii="Consolas" w:cs="Consolas" w:eastAsia="Consolas" w:hAnsi="Consolas"/>
+          <w:color w:val="1E2A33"/>
+          <w:sz w:val="18"/>
+          <w:szCs w:val="18"/>
+        </w:rPr>
+        <w:t xml:space="preserve">            bledy.add("Rok produkcji jest wymagany.");</w:t>
+      </w:r>
+    </w:p>
+    <w:p>
+      <w:pPr>
+        <w:shd w:fill="F3F5F7" w:color="auto" w:val="clear"/>
+        <w:spacing w:after="0" w:line="240"/>
+        <w:ind w:left="200" w:right="200"/>
+      </w:pPr>
+      <w:r>
+        <w:rPr>
+          <w:rFonts w:ascii="Consolas" w:cs="Consolas" w:eastAsia="Consolas" w:hAnsi="Consolas"/>
+          <w:color w:val="1E2A33"/>
+          <w:sz w:val="18"/>
+          <w:szCs w:val="18"/>
+        </w:rPr>
+        <w:t xml:space="preserve">        } else {</w:t>
+      </w:r>
+    </w:p>
+    <w:p>
+      <w:pPr>
+        <w:shd w:fill="F3F5F7" w:color="auto" w:val="clear"/>
+        <w:spacing w:after="0" w:line="240"/>
+        <w:ind w:left="200" w:right="200"/>
+      </w:pPr>
+      <w:r>
+        <w:rPr>
+          <w:rFonts w:ascii="Consolas" w:cs="Consolas" w:eastAsia="Consolas" w:hAnsi="Consolas"/>
+          <w:color w:val="1E2A33"/>
+          <w:sz w:val="18"/>
+          <w:szCs w:val="18"/>
+        </w:rPr>
+        <w:t xml:space="preserve">            try {</w:t>
+      </w:r>
+    </w:p>
+    <w:p>
+      <w:pPr>
+        <w:shd w:fill="F3F5F7" w:color="auto" w:val="clear"/>
+        <w:spacing w:after="0" w:line="240"/>
+        <w:ind w:left="200" w:right="200"/>
+      </w:pPr>
+      <w:r>
+        <w:rPr>
+          <w:rFonts w:ascii="Consolas" w:cs="Consolas" w:eastAsia="Consolas" w:hAnsi="Consolas"/>
+          <w:color w:val="1E2A33"/>
+          <w:sz w:val="18"/>
+          <w:szCs w:val="18"/>
+        </w:rPr>
+        <w:t xml:space="preserve">                int y = Integer.parseInt(rok);</w:t>
+      </w:r>
+    </w:p>
+    <w:p>
+      <w:pPr>
+        <w:shd w:fill="F3F5F7" w:color="auto" w:val="clear"/>
+        <w:spacing w:after="0" w:line="240"/>
+        <w:ind w:left="200" w:right="200"/>
+      </w:pPr>
+      <w:r>
+        <w:rPr>
+          <w:rFonts w:ascii="Consolas" w:cs="Consolas" w:eastAsia="Consolas" w:hAnsi="Consolas"/>
+          <w:color w:val="1E2A33"/>
+          <w:sz w:val="18"/>
+          <w:szCs w:val="18"/>
+        </w:rPr>
+        <w:t xml:space="preserve">                int teraz = Year.now().getValue();</w:t>
+      </w:r>
+    </w:p>
+    <w:p>
+      <w:pPr>
+        <w:shd w:fill="F3F5F7" w:color="auto" w:val="clear"/>
+        <w:spacing w:after="0" w:line="240"/>
+        <w:ind w:left="200" w:right="200"/>
+      </w:pPr>
+      <w:r>
+        <w:rPr>
+          <w:rFonts w:ascii="Consolas" w:cs="Consolas" w:eastAsia="Consolas" w:hAnsi="Consolas"/>
+          <w:color w:val="1E2A33"/>
+          <w:sz w:val="18"/>
+          <w:szCs w:val="18"/>
+        </w:rPr>
+        <w:t xml:space="preserve">                if (y &lt; 1895 || y &gt; teraz) {</w:t>
+      </w:r>
+    </w:p>
+    <w:p>
+      <w:pPr>
+        <w:shd w:fill="F3F5F7" w:color="auto" w:val="clear"/>
+        <w:spacing w:after="0" w:line="240"/>
+        <w:ind w:left="200" w:right="200"/>
+      </w:pPr>
+      <w:r>
+        <w:rPr>
+          <w:rFonts w:ascii="Consolas" w:cs="Consolas" w:eastAsia="Consolas" w:hAnsi="Consolas"/>
+          <w:color w:val="1E2A33"/>
+          <w:sz w:val="18"/>
+          <w:szCs w:val="18"/>
+        </w:rPr>
+        <w:t xml:space="preserve">                    bledy.add("Rok produkcji musi być z zakresu 1895–" + teraz + ".");</w:t>
+      </w:r>
+    </w:p>
+    <w:p>
+      <w:pPr>
+        <w:shd w:fill="F3F5F7" w:color="auto" w:val="clear"/>
+        <w:spacing w:after="0" w:line="240"/>
+        <w:ind w:left="200" w:right="200"/>
+      </w:pPr>
+      <w:r>
+        <w:rPr>
+          <w:rFonts w:ascii="Consolas" w:cs="Consolas" w:eastAsia="Consolas" w:hAnsi="Consolas"/>
+          <w:color w:val="1E2A33"/>
+          <w:sz w:val="18"/>
+          <w:szCs w:val="18"/>
+        </w:rPr>
+        <w:t xml:space="preserve">                }</w:t>
+      </w:r>
+    </w:p>
+    <w:p>
+      <w:pPr>
+        <w:shd w:fill="F3F5F7" w:color="auto" w:val="clear"/>
+        <w:spacing w:after="0" w:line="240"/>
+        <w:ind w:left="200" w:right="200"/>
+      </w:pPr>
+      <w:r>
+        <w:rPr>
+          <w:rFonts w:ascii="Consolas" w:cs="Consolas" w:eastAsia="Consolas" w:hAnsi="Consolas"/>
+          <w:color w:val="1E2A33"/>
+          <w:sz w:val="18"/>
+          <w:szCs w:val="18"/>
+        </w:rPr>
+        <w:t xml:space="preserve">            } catch (NumberFormatException e) {</w:t>
+      </w:r>
+    </w:p>
+    <w:p>
+      <w:pPr>
+        <w:shd w:fill="F3F5F7" w:color="auto" w:val="clear"/>
+        <w:spacing w:after="0" w:line="240"/>
+        <w:ind w:left="200" w:right="200"/>
+      </w:pPr>
+      <w:r>
+        <w:rPr>
+          <w:rFonts w:ascii="Consolas" w:cs="Consolas" w:eastAsia="Consolas" w:hAnsi="Consolas"/>
+          <w:color w:val="1E2A33"/>
+          <w:sz w:val="18"/>
+          <w:szCs w:val="18"/>
+        </w:rPr>
+        <w:t xml:space="preserve">                bledy.add("Rok produkcji musi być liczbą.");</w:t>
+      </w:r>
+    </w:p>
+    <w:p>
+      <w:pPr>
+        <w:shd w:fill="F3F5F7" w:color="auto" w:val="clear"/>
+        <w:spacing w:after="0" w:line="240"/>
+        <w:ind w:left="200" w:right="200"/>
+      </w:pPr>
+      <w:r>
+        <w:rPr>
+          <w:rFonts w:ascii="Consolas" w:cs="Consolas" w:eastAsia="Consolas" w:hAnsi="Consolas"/>
+          <w:color w:val="1E2A33"/>
+          <w:sz w:val="18"/>
+          <w:szCs w:val="18"/>
+        </w:rPr>
+        <w:t xml:space="preserve">            }</w:t>
+      </w:r>
+    </w:p>
+    <w:p>
+      <w:pPr>
+        <w:shd w:fill="F3F5F7" w:color="auto" w:val="clear"/>
+        <w:spacing w:after="0" w:line="240"/>
+        <w:ind w:left="200" w:right="200"/>
+      </w:pPr>
+      <w:r>
+        <w:rPr>
+          <w:rFonts w:ascii="Consolas" w:cs="Consolas" w:eastAsia="Consolas" w:hAnsi="Consolas"/>
+          <w:color w:val="1E2A33"/>
+          <w:sz w:val="18"/>
+          <w:szCs w:val="18"/>
+        </w:rPr>
+        <w:t xml:space="preserve">        }</w:t>
+      </w:r>
+    </w:p>
+    <w:p>
+      <w:pPr>
+        <w:shd w:fill="F3F5F7" w:color="auto" w:val="clear"/>
+        <w:spacing w:after="0" w:line="240"/>
+        <w:ind w:left="200" w:right="200"/>
+      </w:pPr>
+      <w:r>
+        <w:rPr>
+          <w:rFonts w:ascii="Consolas" w:cs="Consolas" w:eastAsia="Consolas" w:hAnsi="Consolas"/>
+          <w:color w:val="1E2A33"/>
+          <w:sz w:val="18"/>
+          <w:szCs w:val="18"/>
+        </w:rPr>
+        <w:t xml:space="preserve"/>
+      </w:r>
+    </w:p>
+    <w:p>
+      <w:pPr>
+        <w:shd w:fill="F3F5F7" w:color="auto" w:val="clear"/>
+        <w:spacing w:after="0" w:line="240"/>
+        <w:ind w:left="200" w:right="200"/>
+      </w:pPr>
+      <w:r>
+        <w:rPr>
+          <w:rFonts w:ascii="Consolas" w:cs="Consolas" w:eastAsia="Consolas" w:hAnsi="Consolas"/>
+          <w:color w:val="1E2A33"/>
+          <w:sz w:val="18"/>
+          <w:szCs w:val="18"/>
+        </w:rPr>
+        <w:t xml:space="preserve">        if (!bledy.isEmpty()) {</w:t>
+      </w:r>
+    </w:p>
+    <w:p>
+      <w:pPr>
+        <w:shd w:fill="F3F5F7" w:color="auto" w:val="clear"/>
+        <w:spacing w:after="0" w:line="240"/>
+        <w:ind w:left="200" w:right="200"/>
+      </w:pPr>
+      <w:r>
+        <w:rPr>
+          <w:rFonts w:ascii="Consolas" w:cs="Consolas" w:eastAsia="Consolas" w:hAnsi="Consolas"/>
+          <w:color w:val="1E2A33"/>
+          <w:sz w:val="18"/>
+          <w:szCs w:val="18"/>
+        </w:rPr>
+        <w:t xml:space="preserve">            renderForm(req, resp, bledy, tytul, rezyser, rok);</w:t>
+      </w:r>
+    </w:p>
+    <w:p>
+      <w:pPr>
+        <w:shd w:fill="F3F5F7" w:color="auto" w:val="clear"/>
+        <w:spacing w:after="0" w:line="240"/>
+        <w:ind w:left="200" w:right="200"/>
+      </w:pPr>
+      <w:r>
+        <w:rPr>
+          <w:rFonts w:ascii="Consolas" w:cs="Consolas" w:eastAsia="Consolas" w:hAnsi="Consolas"/>
+          <w:color w:val="1E2A33"/>
+          <w:sz w:val="18"/>
+          <w:szCs w:val="18"/>
+        </w:rPr>
+        <w:t xml:space="preserve">            return;</w:t>
+      </w:r>
+    </w:p>
+    <w:p>
+      <w:pPr>
+        <w:shd w:fill="F3F5F7" w:color="auto" w:val="clear"/>
+        <w:spacing w:after="0" w:line="240"/>
+        <w:ind w:left="200" w:right="200"/>
+      </w:pPr>
+      <w:r>
+        <w:rPr>
+          <w:rFonts w:ascii="Consolas" w:cs="Consolas" w:eastAsia="Consolas" w:hAnsi="Consolas"/>
+          <w:color w:val="1E2A33"/>
+          <w:sz w:val="18"/>
+          <w:szCs w:val="18"/>
+        </w:rPr>
+        <w:t xml:space="preserve">        }</w:t>
+      </w:r>
+    </w:p>
+    <w:p>
+      <w:pPr>
+        <w:shd w:fill="F3F5F7" w:color="auto" w:val="clear"/>
+        <w:spacing w:after="0" w:line="240"/>
+        <w:ind w:left="200" w:right="200"/>
+      </w:pPr>
+      <w:r>
+        <w:rPr>
+          <w:rFonts w:ascii="Consolas" w:cs="Consolas" w:eastAsia="Consolas" w:hAnsi="Consolas"/>
+          <w:color w:val="1E2A33"/>
+          <w:sz w:val="18"/>
+          <w:szCs w:val="18"/>
+        </w:rPr>
+        <w:t xml:space="preserve">        String encoded = URLEncoder.encode(tytul, StandardCharsets.UTF_8);</w:t>
+      </w:r>
+    </w:p>
+    <w:p>
+      <w:pPr>
+        <w:shd w:fill="F3F5F7" w:color="auto" w:val="clear"/>
+        <w:spacing w:after="0" w:line="240"/>
+        <w:ind w:left="200" w:right="200"/>
+      </w:pPr>
+      <w:r>
+        <w:rPr>
+          <w:rFonts w:ascii="Consolas" w:cs="Consolas" w:eastAsia="Consolas" w:hAnsi="Consolas"/>
+          <w:color w:val="1E2A33"/>
+          <w:sz w:val="18"/>
+          <w:szCs w:val="18"/>
+        </w:rPr>
+        <w:t xml:space="preserve">        resp.sendRedirect(req.getContextPath() + "/filmy/dodany?tytul=" + encoded);</w:t>
+      </w:r>
+    </w:p>
+    <w:p>
+      <w:pPr>
+        <w:shd w:fill="F3F5F7" w:color="auto" w:val="clear"/>
+        <w:spacing w:after="0" w:line="240"/>
+        <w:ind w:left="200" w:right="200"/>
+      </w:pPr>
+      <w:r>
+        <w:rPr>
+          <w:rFonts w:ascii="Consolas" w:cs="Consolas" w:eastAsia="Consolas" w:hAnsi="Consolas"/>
+          <w:color w:val="1E2A33"/>
+          <w:sz w:val="18"/>
+          <w:szCs w:val="18"/>
+        </w:rPr>
+        <w:t xml:space="preserve">    }</w:t>
       </w:r>
     </w:p>
     <w:p>
@@ -6835,7 +7439,7 @@
           <w:sz w:val="18"/>
           <w:szCs w:val="18"/>
         </w:rPr>
-        <w:t xml:space="preserve">Listing 1. [opis fragmentu kodu]</w:t>
+        <w:t xml:space="preserve">Listing 1. Walidacja i przekierowanie w FilmFormServlet</w:t>
       </w:r>
     </w:p>
     <w:p>
@@ -9280,13 +9884,10 @@
             </w:pPr>
             <w:r>
               <w:rPr>
-                <w:i/>
-                <w:iCs/>
-                <w:color w:val="8A969E"/>
                 <w:sz w:val="18"/>
                 <w:szCs w:val="18"/>
               </w:rPr>
-              <w:t xml:space="preserve">[np. Dodanie książki bez tytułu]</w:t>
+              <w:t xml:space="preserve">Dodanie filmu bez tytułu</w:t>
             </w:r>
           </w:p>
         </w:tc>
@@ -9313,13 +9914,10 @@
             </w:pPr>
             <w:r>
               <w:rPr>
-                <w:i/>
-                <w:iCs/>
-                <w:color w:val="8A969E"/>
                 <w:sz w:val="18"/>
                 <w:szCs w:val="18"/>
               </w:rPr>
-              <w:t xml:space="preserve">[ręczny]</w:t>
+              <w:t xml:space="preserve">ręczny</w:t>
             </w:r>
           </w:p>
         </w:tc>
@@ -9346,13 +9944,10 @@
             </w:pPr>
             <w:r>
               <w:rPr>
-                <w:i/>
-                <w:iCs/>
-                <w:color w:val="8A969E"/>
                 <w:sz w:val="18"/>
                 <w:szCs w:val="18"/>
               </w:rPr>
-              <w:t xml:space="preserve">[komunikat „Tytuł jest wymagany”]</w:t>
+              <w:t xml:space="preserve">Komunikat „Tytuł jest wymagany.”, wpisane pola zostają</w:t>
             </w:r>
           </w:p>
         </w:tc>
@@ -9380,13 +9975,10 @@
             </w:pPr>
             <w:r>
               <w:rPr>
-                <w:i/>
-                <w:iCs/>
-                <w:color w:val="8A969E"/>
                 <w:sz w:val="18"/>
                 <w:szCs w:val="18"/>
               </w:rPr>
-              <w:t xml:space="preserve">[OK]</w:t>
+              <w:t xml:space="preserve">OK</w:t>
             </w:r>
           </w:p>
         </w:tc>
@@ -9447,6 +10039,13 @@
             <w:pPr>
               <w:spacing w:after="40" w:line="252"/>
             </w:pPr>
+            <w:r>
+              <w:rPr>
+                <w:sz w:val="18"/>
+                <w:szCs w:val="18"/>
+              </w:rPr>
+              <w:t>Rok produkcji wpisany jako abc</w:t>
+            </w:r>
           </w:p>
         </w:tc>
         <w:tc>
@@ -9470,6 +10069,13 @@
             <w:pPr>
               <w:spacing w:after="40" w:line="252"/>
             </w:pPr>
+            <w:r>
+              <w:rPr>
+                <w:sz w:val="18"/>
+                <w:szCs w:val="18"/>
+              </w:rPr>
+              <w:t>ręczny</w:t>
+            </w:r>
           </w:p>
         </w:tc>
         <w:tc>
@@ -9493,6 +10099,13 @@
             <w:pPr>
               <w:spacing w:after="40" w:line="252"/>
             </w:pPr>
+            <w:r>
+              <w:rPr>
+                <w:sz w:val="18"/>
+                <w:szCs w:val="18"/>
+              </w:rPr>
+              <w:t>Komunikat, że rok musi być liczbą</w:t>
+            </w:r>
           </w:p>
         </w:tc>
         <w:tc>
@@ -9517,6 +10130,13 @@
               <w:spacing w:after="40" w:line="252"/>
               <w:jc w:val="center"/>
             </w:pPr>
+            <w:r>
+              <w:rPr>
+                <w:sz w:val="18"/>
+                <w:szCs w:val="18"/>
+              </w:rPr>
+              <w:t>OK</w:t>
+            </w:r>
           </w:p>
         </w:tc>
       </w:tr>
@@ -9576,6 +10196,13 @@
             <w:pPr>
               <w:spacing w:after="40" w:line="252"/>
             </w:pPr>
+            <w:r>
+              <w:rPr>
+                <w:sz w:val="18"/>
+                <w:szCs w:val="18"/>
+              </w:rPr>
+              <w:t>Rok produkcji 3000</w:t>
+            </w:r>
           </w:p>
         </w:tc>
         <w:tc>
@@ -9599,6 +10226,13 @@
             <w:pPr>
               <w:spacing w:after="40" w:line="252"/>
             </w:pPr>
+            <w:r>
+              <w:rPr>
+                <w:sz w:val="18"/>
+                <w:szCs w:val="18"/>
+              </w:rPr>
+              <w:t>ręczny</w:t>
+            </w:r>
           </w:p>
         </w:tc>
         <w:tc>
@@ -9622,6 +10256,13 @@
             <w:pPr>
               <w:spacing w:after="40" w:line="252"/>
             </w:pPr>
+            <w:r>
+              <w:rPr>
+                <w:sz w:val="18"/>
+                <w:szCs w:val="18"/>
+              </w:rPr>
+              <w:t>Komunikat, że rok ma być z zakresu 1895–bieżący rok</w:t>
+            </w:r>
           </w:p>
         </w:tc>
         <w:tc>
@@ -9646,6 +10287,13 @@
               <w:spacing w:after="40" w:line="252"/>
               <w:jc w:val="center"/>
             </w:pPr>
+            <w:r>
+              <w:rPr>
+                <w:sz w:val="18"/>
+                <w:szCs w:val="18"/>
+              </w:rPr>
+              <w:t>OK</w:t>
+            </w:r>
           </w:p>
         </w:tc>
       </w:tr>
@@ -9705,6 +10353,13 @@
             <w:pPr>
               <w:spacing w:after="40" w:line="252"/>
             </w:pPr>
+            <w:r>
+              <w:rPr>
+                <w:sz w:val="18"/>
+                <w:szCs w:val="18"/>
+              </w:rPr>
+              <w:t>Seksmisja, Juliusz Machulski, 1983</w:t>
+            </w:r>
           </w:p>
         </w:tc>
         <w:tc>
@@ -9728,6 +10383,13 @@
             <w:pPr>
               <w:spacing w:after="40" w:line="252"/>
             </w:pPr>
+            <w:r>
+              <w:rPr>
+                <w:sz w:val="18"/>
+                <w:szCs w:val="18"/>
+              </w:rPr>
+              <w:t>ręczny</w:t>
+            </w:r>
           </w:p>
         </w:tc>
         <w:tc>
@@ -9751,6 +10413,13 @@
             <w:pPr>
               <w:spacing w:after="40" w:line="252"/>
             </w:pPr>
+            <w:r>
+              <w:rPr>
+                <w:sz w:val="18"/>
+                <w:szCs w:val="18"/>
+              </w:rPr>
+              <w:t>Przekierowanie na /filmy/dodany. F5 nie wysyła formularza ponownie</w:t>
+            </w:r>
           </w:p>
         </w:tc>
         <w:tc>
@@ -9775,6 +10444,13 @@
               <w:spacing w:after="40" w:line="252"/>
               <w:jc w:val="center"/>
             </w:pPr>
+            <w:r>
+              <w:rPr>
+                <w:sz w:val="18"/>
+                <w:szCs w:val="18"/>
+              </w:rPr>
+              <w:t>OK</w:t>
+            </w:r>
           </w:p>
         </w:tc>
       </w:tr>
@@ -9834,6 +10510,13 @@
             <w:pPr>
               <w:spacing w:after="40" w:line="252"/>
             </w:pPr>
+            <w:r>
+              <w:rPr>
+                <w:sz w:val="18"/>
+                <w:szCs w:val="18"/>
+              </w:rPr>
+              <w:t>Kilka wejść na /lifecycle i zatrzymanie Tomcata</w:t>
+            </w:r>
           </w:p>
         </w:tc>
         <w:tc>
@@ -9857,6 +10540,13 @@
             <w:pPr>
               <w:spacing w:after="40" w:line="252"/>
             </w:pPr>
+            <w:r>
+              <w:rPr>
+                <w:sz w:val="18"/>
+                <w:szCs w:val="18"/>
+              </w:rPr>
+              <w:t>ręczny</w:t>
+            </w:r>
           </w:p>
         </w:tc>
         <w:tc>
@@ -9880,6 +10570,13 @@
             <w:pPr>
               <w:spacing w:after="40" w:line="252"/>
             </w:pPr>
+            <w:r>
+              <w:rPr>
+                <w:sz w:val="18"/>
+                <w:szCs w:val="18"/>
+              </w:rPr>
+              <w:t>Licznik rośnie, w logu są init() i destroy()</w:t>
+            </w:r>
           </w:p>
         </w:tc>
         <w:tc>
@@ -9904,6 +10601,13 @@
               <w:spacing w:after="40" w:line="252"/>
               <w:jc w:val="center"/>
             </w:pPr>
+            <w:r>
+              <w:rPr>
+                <w:sz w:val="18"/>
+                <w:szCs w:val="18"/>
+              </w:rPr>
+              <w:t>OK</w:t>
+            </w:r>
           </w:p>
         </w:tc>
       </w:tr>
@@ -10336,34 +11040,41 @@
             <w:pPr>
               <w:spacing w:after="40" w:line="252"/>
             </w:pPr>
-          </w:p>
-        </w:tc>
-        <w:tc>
-          <w:tcPr>
-            <w:tcW w:type="dxa" w:w="2300"/>
-            <w:tcBorders>
-              <w:top w:val="single" w:color="B8C4CC" w:sz="4"/>
-              <w:left w:val="single" w:color="B8C4CC" w:sz="4"/>
-              <w:bottom w:val="single" w:color="B8C4CC" w:sz="4"/>
-              <w:right w:val="single" w:color="B8C4CC" w:sz="4"/>
-            </w:tcBorders>
-            <w:tcMar>
-              <w:top w:type="dxa" w:w="70"/>
-              <w:left w:type="dxa" w:w="100"/>
-              <w:bottom w:type="dxa" w:w="70"/>
-              <w:right w:type="dxa" w:w="100"/>
-            </w:tcMar>
-            <w:vAlign w:val="top"/>
-          </w:tcPr>
-          <w:p>
-            <w:pPr>
-              <w:spacing w:after="40" w:line="252"/>
-            </w:pPr>
             <w:r>
               <w:rPr>
                 <w:sz w:val="18"/>
                 <w:szCs w:val="18"/>
               </w:rPr>
+              <w:t>24.10.2026</w:t>
+            </w:r>
+          </w:p>
+        </w:tc>
+        <w:tc>
+          <w:tcPr>
+            <w:tcW w:type="dxa" w:w="2300"/>
+            <w:tcBorders>
+              <w:top w:val="single" w:color="B8C4CC" w:sz="4"/>
+              <w:left w:val="single" w:color="B8C4CC" w:sz="4"/>
+              <w:bottom w:val="single" w:color="B8C4CC" w:sz="4"/>
+              <w:right w:val="single" w:color="B8C4CC" w:sz="4"/>
+            </w:tcBorders>
+            <w:tcMar>
+              <w:top w:type="dxa" w:w="70"/>
+              <w:left w:type="dxa" w:w="100"/>
+              <w:bottom w:type="dxa" w:w="70"/>
+              <w:right w:type="dxa" w:w="100"/>
+            </w:tcMar>
+            <w:vAlign w:val="top"/>
+          </w:tcPr>
+          <w:p>
+            <w:pPr>
+              <w:spacing w:after="40" w:line="252"/>
+            </w:pPr>
+            <w:r>
+              <w:rPr>
+                <w:sz w:val="18"/>
+                <w:szCs w:val="18"/>
+              </w:rPr>
               <w:t xml:space="preserve">etap-02</w:t>
             </w:r>
           </w:p>
@@ -10389,6 +11100,13 @@
             <w:pPr>
               <w:spacing w:after="40" w:line="252"/>
             </w:pPr>
+            <w:r>
+              <w:rPr>
+                <w:sz w:val="18"/>
+                <w:szCs w:val="18"/>
+              </w:rPr>
+              <w:t>Formularz /filmy/add (tytuł, reżyser, rok) z walidacją, redirect na /filmy/dodany, servlety /info i /lifecycle.</w:t>
+            </w:r>
           </w:p>
         </w:tc>
         <w:tc>
@@ -10412,6 +11130,13 @@
             <w:pPr>
               <w:spacing w:after="40" w:line="252"/>
             </w:pPr>
+            <w:r>
+              <w:rPr>
+                <w:sz w:val="18"/>
+                <w:szCs w:val="18"/>
+              </w:rPr>
+              <w:t>Po POST odświeżenie pytało o ponowne wysłanie. Zamiast zostać na formularzu dałem sendRedirect, z getContextPath() na początku adresu.</w:t>
+            </w:r>
           </w:p>
         </w:tc>
       </w:tr>

</xml_diff>